<commit_message>
Docs: DB strategy + buyer-consent design + Richard email + regenerated manuals; prod bootstrap SQL
</commit_message>
<xml_diff>
--- a/docs/manuals/EarnedHome-Broker-Administrator-Manual.docx
+++ b/docs/manuals/EarnedHome-Broker-Administrator-Manual.docx
@@ -453,6 +453,30 @@
           <w:szCs w:val="24"/>
         </w:rPr>
         <w:t xml:space="preserve">12.   </w:t>
+      </w:r>
+      <w:r>
+        <w:rPr>
+          <w:color w:val="222222"/>
+          <w:sz w:val="24"/>
+          <w:szCs w:val="24"/>
+        </w:rPr>
+        <w:t xml:space="preserve">Common questions</w:t>
+      </w:r>
+    </w:p>
+    <w:p>
+      <w:pPr>
+        <w:spacing w:after="90" w:line="300"/>
+        <w:ind w:left="40"/>
+      </w:pPr>
+      <w:r>
+        <w:rPr>
+          <w:b/>
+          <w:bCs/>
+          <w:color w:val="1F4E79"/>
+          <w:sz w:val="24"/>
+          <w:szCs w:val="24"/>
+        </w:rPr>
+        <w:t xml:space="preserve">13.   </w:t>
       </w:r>
       <w:r>
         <w:rPr>
@@ -850,6 +874,101 @@
         <w:t xml:space="preserve"> dashboard, where you can see every loan officer's activity.</w:t>
       </w:r>
     </w:p>
+    <w:tbl>
+      <w:tblPr>
+        <w:tblW w:type="dxa" w:w="9360"/>
+        <w:tblBorders>
+          <w:top w:val="single" w:color="auto" w:sz="4"/>
+          <w:left w:val="single" w:color="auto" w:sz="4"/>
+          <w:bottom w:val="single" w:color="auto" w:sz="4"/>
+          <w:right w:val="single" w:color="auto" w:sz="4"/>
+          <w:insideH w:val="single" w:color="auto" w:sz="4"/>
+          <w:insideV w:val="single" w:color="auto" w:sz="4"/>
+        </w:tblBorders>
+      </w:tblPr>
+      <w:tblGrid>
+        <w:gridCol w:w="9360"/>
+      </w:tblGrid>
+      <w:tr>
+        <w:tc>
+          <w:tcPr>
+            <w:tcW w:type="dxa" w:w="9360"/>
+            <w:tcBorders>
+              <w:top w:val="none"/>
+              <w:left w:val="single" w:color="2E75B6" w:sz="18"/>
+              <w:bottom w:val="none"/>
+              <w:right w:val="none"/>
+            </w:tcBorders>
+            <w:shd w:fill="EAF1F8" w:val="clear"/>
+            <w:tcMar>
+              <w:top w:type="dxa" w:w="120"/>
+              <w:left w:type="dxa" w:w="200"/>
+              <w:bottom w:type="dxa" w:w="120"/>
+              <w:right w:type="dxa" w:w="160"/>
+            </w:tcMar>
+          </w:tcPr>
+          <w:p>
+            <w:r>
+              <w:rPr>
+                <w:b/>
+                <w:bCs/>
+                <w:color w:val="2E75B6"/>
+              </w:rPr>
+              <w:t xml:space="preserve">Note: </w:t>
+            </w:r>
+            <w:r>
+              <w:rPr>
+                <w:b w:val="false"/>
+                <w:bCs w:val="false"/>
+              </w:rPr>
+              <w:t xml:space="preserve">For security, EarnedHome signs you out after </w:t>
+            </w:r>
+            <w:r>
+              <w:rPr>
+                <w:b/>
+                <w:bCs/>
+              </w:rPr>
+              <w:t xml:space="preserve">15 minutes of inactivity</w:t>
+            </w:r>
+            <w:r>
+              <w:rPr>
+                <w:b w:val="false"/>
+                <w:bCs w:val="false"/>
+              </w:rPr>
+              <w:t xml:space="preserve">. A </w:t>
+            </w:r>
+            <w:r>
+              <w:rPr>
+                <w:b/>
+                <w:bCs/>
+              </w:rPr>
+              <w:t xml:space="preserve">"Still there?"</w:t>
+            </w:r>
+            <w:r>
+              <w:rPr>
+                <w:b w:val="false"/>
+                <w:bCs w:val="false"/>
+              </w:rPr>
+              <w:t xml:space="preserve"> prompt appears a minute before it happens — any activity (or selecting </w:t>
+            </w:r>
+            <w:r>
+              <w:rPr>
+                <w:b/>
+                <w:bCs/>
+              </w:rPr>
+              <w:t xml:space="preserve">Stay signed in</w:t>
+            </w:r>
+            <w:r>
+              <w:rPr>
+                <w:b w:val="false"/>
+                <w:bCs w:val="false"/>
+              </w:rPr>
+              <w:t xml:space="preserve">) keeps you in.</w:t>
+            </w:r>
+          </w:p>
+        </w:tc>
+      </w:tr>
+    </w:tbl>
     <w:p>
       <w:pPr>
         <w:pStyle w:val="Heading1"/>
@@ -1024,7 +1143,21 @@
           <w:b w:val="false"/>
           <w:bCs w:val="false"/>
         </w:rPr>
-        <w:t xml:space="preserve">Click a row to expand the buyer's scenario, the quote they saw, and notes.</w:t>
+        <w:t xml:space="preserve">Beside a referring agent you'll see an </w:t>
+      </w:r>
+      <w:r>
+        <w:rPr>
+          <w:b/>
+          <w:bCs/>
+        </w:rPr>
+        <w:t xml:space="preserve">Agent updates: Yes / No</w:t>
+      </w:r>
+      <w:r>
+        <w:rPr>
+          <w:b w:val="false"/>
+          <w:bCs w:val="false"/>
+        </w:rPr>
+        <w:t xml:space="preserve"> badge — whether that buyer authorized the agent to see their loan status.</w:t>
       </w:r>
     </w:p>
     <w:p>
@@ -1038,6 +1171,23 @@
       </w:pPr>
       <w:r>
         <w:rPr>
+          <w:b w:val="false"/>
+          <w:bCs w:val="false"/>
+        </w:rPr>
+        <w:t xml:space="preserve">Click a row to expand the buyer's scenario, the quote they saw, and notes.</w:t>
+      </w:r>
+    </w:p>
+    <w:p>
+      <w:pPr>
+        <w:pStyle w:val="ListParagraph"/>
+        <w:numPr>
+          <w:ilvl w:val="0"/>
+          <w:numId w:val="2"/>
+        </w:numPr>
+        <w:spacing w:after="70" w:line="272"/>
+      </w:pPr>
+      <w:r>
+        <w:rPr>
           <w:b/>
           <w:bCs/>
         </w:rPr>
@@ -1082,7 +1232,7 @@
           <w:b/>
           <w:bCs/>
         </w:rPr>
-        <w:t xml:space="preserve">View EarnedHome</w:t>
+        <w:t xml:space="preserve">View site</w:t>
       </w:r>
       <w:r>
         <w:rPr>
@@ -1145,7 +1295,21 @@
           <w:b w:val="false"/>
           <w:bCs w:val="false"/>
         </w:rPr>
-        <w:t xml:space="preserve">.</w:t>
+        <w:t xml:space="preserve">. The header also shows </w:t>
+      </w:r>
+      <w:r>
+        <w:rPr>
+          <w:b/>
+          <w:bCs/>
+        </w:rPr>
+        <w:t xml:space="preserve">"Signed in: your name · role"</w:t>
+      </w:r>
+      <w:r>
+        <w:rPr>
+          <w:b w:val="false"/>
+          <w:bCs w:val="false"/>
+        </w:rPr>
+        <w:t xml:space="preserve"> so you always know which account you're in.</w:t>
       </w:r>
     </w:p>
     <w:p>
@@ -1235,7 +1399,7 @@
           <w:b w:val="false"/>
           <w:bCs w:val="false"/>
         </w:rPr>
-        <w:t xml:space="preserve"> (must be unique), and </w:t>
+        <w:t xml:space="preserve"> (must be unique), </w:t>
       </w:r>
       <w:r>
         <w:rPr>
@@ -1249,7 +1413,21 @@
           <w:b w:val="false"/>
           <w:bCs w:val="false"/>
         </w:rPr>
-        <w:t xml:space="preserve"> number.</w:t>
+        <w:t xml:space="preserve"> number, and </w:t>
+      </w:r>
+      <w:r>
+        <w:rPr>
+          <w:b/>
+          <w:bCs/>
+        </w:rPr>
+        <w:t xml:space="preserve">Phone</w:t>
+      </w:r>
+      <w:r>
+        <w:rPr>
+          <w:b w:val="false"/>
+          <w:bCs w:val="false"/>
+        </w:rPr>
+        <w:t xml:space="preserve"> (a contact number kept on record).</w:t>
       </w:r>
     </w:p>
     <w:p>
@@ -1325,7 +1503,21 @@
           <w:b w:val="false"/>
           <w:bCs w:val="false"/>
         </w:rPr>
-        <w:t xml:space="preserve">. They click it, set a password, and reach their dashboard.</w:t>
+        <w:t xml:space="preserve">. It opens a secure EarnedHome page with a </w:t>
+      </w:r>
+      <w:r>
+        <w:rPr>
+          <w:b/>
+          <w:bCs/>
+        </w:rPr>
+        <w:t xml:space="preserve">Continue</w:t>
+      </w:r>
+      <w:r>
+        <w:rPr>
+          <w:b w:val="false"/>
+          <w:bCs w:val="false"/>
+        </w:rPr>
+        <w:t xml:space="preserve"> button; they set a password and reach their dashboard.</w:t>
       </w:r>
     </w:p>
     <w:tbl>
@@ -1472,7 +1664,7 @@
           <w:b w:val="false"/>
           <w:bCs w:val="false"/>
         </w:rPr>
-        <w:t xml:space="preserve"> — update an LO's name, email, or NMLS.</w:t>
+        <w:t xml:space="preserve"> — update an LO's name, email, NMLS, or phone.</w:t>
       </w:r>
     </w:p>
     <w:p>
@@ -1496,7 +1688,35 @@
           <w:b w:val="false"/>
           <w:bCs w:val="false"/>
         </w:rPr>
-        <w:t xml:space="preserve"> — deactivate the seat (they can no longer sign in or receive routed leads); </w:t>
+        <w:t xml:space="preserve"> — </w:t>
+      </w:r>
+      <w:r>
+        <w:rPr>
+          <w:b/>
+          <w:bCs/>
+        </w:rPr>
+        <w:t xml:space="preserve">fully deactivates</w:t>
+      </w:r>
+      <w:r>
+        <w:rPr>
+          <w:b w:val="false"/>
+          <w:bCs w:val="false"/>
+        </w:rPr>
+        <w:t xml:space="preserve"> the loan officer: they can no longer sign in, they stop receiving routed leads, and </w:t>
+      </w:r>
+      <w:r>
+        <w:rPr>
+          <w:b/>
+          <w:bCs/>
+        </w:rPr>
+        <w:t xml:space="preserve">their referral partners' share links and status pages are revoked too</w:t>
+      </w:r>
+      <w:r>
+        <w:rPr>
+          <w:b w:val="false"/>
+          <w:bCs w:val="false"/>
+        </w:rPr>
+        <w:t xml:space="preserve">. </w:t>
       </w:r>
       <w:r>
         <w:rPr>
@@ -1510,9 +1730,76 @@
           <w:b w:val="false"/>
           <w:bCs w:val="false"/>
         </w:rPr>
-        <w:t xml:space="preserve"> to restore.</w:t>
-      </w:r>
-    </w:p>
+        <w:t xml:space="preserve"> restores everything.</w:t>
+      </w:r>
+    </w:p>
+    <w:tbl>
+      <w:tblPr>
+        <w:tblW w:type="dxa" w:w="9360"/>
+        <w:tblBorders>
+          <w:top w:val="single" w:color="auto" w:sz="4"/>
+          <w:left w:val="single" w:color="auto" w:sz="4"/>
+          <w:bottom w:val="single" w:color="auto" w:sz="4"/>
+          <w:right w:val="single" w:color="auto" w:sz="4"/>
+          <w:insideH w:val="single" w:color="auto" w:sz="4"/>
+          <w:insideV w:val="single" w:color="auto" w:sz="4"/>
+        </w:tblBorders>
+      </w:tblPr>
+      <w:tblGrid>
+        <w:gridCol w:w="9360"/>
+      </w:tblGrid>
+      <w:tr>
+        <w:tc>
+          <w:tcPr>
+            <w:tcW w:type="dxa" w:w="9360"/>
+            <w:tcBorders>
+              <w:top w:val="none"/>
+              <w:left w:val="single" w:color="B8860B" w:sz="18"/>
+              <w:bottom w:val="none"/>
+              <w:right w:val="none"/>
+            </w:tcBorders>
+            <w:shd w:fill="FFF8E1" w:val="clear"/>
+            <w:tcMar>
+              <w:top w:type="dxa" w:w="120"/>
+              <w:left w:type="dxa" w:w="200"/>
+              <w:bottom w:type="dxa" w:w="120"/>
+              <w:right w:type="dxa" w:w="160"/>
+            </w:tcMar>
+          </w:tcPr>
+          <w:p>
+            <w:r>
+              <w:rPr>
+                <w:b/>
+                <w:bCs/>
+                <w:color w:val="B8860B"/>
+              </w:rPr>
+              <w:t xml:space="preserve">Important: </w:t>
+            </w:r>
+            <w:r>
+              <w:rPr>
+                <w:b w:val="false"/>
+                <w:bCs w:val="false"/>
+              </w:rPr>
+              <w:t xml:space="preserve">You can't turn off the </w:t>
+            </w:r>
+            <w:r>
+              <w:rPr>
+                <w:b/>
+                <w:bCs/>
+              </w:rPr>
+              <w:t xml:space="preserve">last active broker admin</w:t>
+            </w:r>
+            <w:r>
+              <w:rPr>
+                <w:b w:val="false"/>
+                <w:bCs w:val="false"/>
+              </w:rPr>
+              <w:t xml:space="preserve"> — EarnedHome blocks it so no one is ever locked out of the dashboard.</w:t>
+            </w:r>
+          </w:p>
+        </w:tc>
+      </w:tr>
+    </w:tbl>
     <w:p>
       <w:pPr>
         <w:spacing w:after="120" w:line="276"/>
@@ -1786,7 +2073,7 @@
           <w:b/>
           <w:bCs/>
         </w:rPr>
-        <w:t xml:space="preserve">Email link</w:t>
+        <w:t xml:space="preserve">Email links</w:t>
       </w:r>
       <w:r>
         <w:rPr>
@@ -1807,7 +2094,7 @@
           <w:b w:val="false"/>
           <w:bCs w:val="false"/>
         </w:rPr>
-        <w:t xml:space="preserve"> links in one email with bookmark guidance.</w:t>
+        <w:t xml:space="preserve"> links in one email with bookmark guidance. (The share URL is also shown under the agent's name if you'd rather copy it yourself.)</w:t>
       </w:r>
     </w:p>
     <w:p>
@@ -1824,28 +2111,14 @@
           <w:b/>
           <w:bCs/>
         </w:rPr>
-        <w:t xml:space="preserve">Copy link</w:t>
-      </w:r>
-      <w:r>
-        <w:rPr>
-          <w:b w:val="false"/>
-          <w:bCs w:val="false"/>
-        </w:rPr>
-        <w:t xml:space="preserve"> / </w:t>
-      </w:r>
-      <w:r>
-        <w:rPr>
-          <w:b/>
-          <w:bCs/>
-        </w:rPr>
-        <w:t xml:space="preserve">Status link</w:t>
-      </w:r>
-      <w:r>
-        <w:rPr>
-          <w:b w:val="false"/>
-          <w:bCs w:val="false"/>
-        </w:rPr>
-        <w:t xml:space="preserve"> — copy either URL to send yourself.</w:t>
+        <w:t xml:space="preserve">Edit</w:t>
+      </w:r>
+      <w:r>
+        <w:rPr>
+          <w:b w:val="false"/>
+          <w:bCs w:val="false"/>
+        </w:rPr>
+        <w:t xml:space="preserve"> — update the agent's details.</w:t>
       </w:r>
     </w:p>
     <w:p>
@@ -1862,30 +2135,6 @@
           <w:b/>
           <w:bCs/>
         </w:rPr>
-        <w:t xml:space="preserve">Edit</w:t>
-      </w:r>
-      <w:r>
-        <w:rPr>
-          <w:b w:val="false"/>
-          <w:bCs w:val="false"/>
-        </w:rPr>
-        <w:t xml:space="preserve"> — update the agent's details.</w:t>
-      </w:r>
-    </w:p>
-    <w:p>
-      <w:pPr>
-        <w:pStyle w:val="ListParagraph"/>
-        <w:numPr>
-          <w:ilvl w:val="0"/>
-          <w:numId w:val="6"/>
-        </w:numPr>
-        <w:spacing w:after="70" w:line="272"/>
-      </w:pPr>
-      <w:r>
-        <w:rPr>
-          <w:b/>
-          <w:bCs/>
-        </w:rPr>
         <w:t xml:space="preserve">Turn off</w:t>
       </w:r>
       <w:r>
@@ -2032,7 +2281,21 @@
           <w:b w:val="false"/>
           <w:bCs w:val="false"/>
         </w:rPr>
-        <w:t xml:space="preserve"> column and is who works the lead and appears to the buyer as their loan officer.</w:t>
+        <w:t xml:space="preserve"> column, works the lead, appears to the buyer as their loan officer, and </w:t>
+      </w:r>
+      <w:r>
+        <w:rPr>
+          <w:b/>
+          <w:bCs/>
+        </w:rPr>
+        <w:t xml:space="preserve">receives the new-lead alert in their own inbox</w:t>
+      </w:r>
+      <w:r>
+        <w:rPr>
+          <w:b w:val="false"/>
+          <w:bCs w:val="false"/>
+        </w:rPr>
+        <w:t xml:space="preserve">.</w:t>
       </w:r>
     </w:p>
     <w:p>
@@ -2341,7 +2604,21 @@
           <w:b w:val="false"/>
           <w:bCs w:val="false"/>
         </w:rPr>
-        <w:t xml:space="preserve"> go out automatically: the buyer gets their estimate, the loan officer gets a new-lead alert, and (if the buyer came through an agent) the agent gets a copy.</w:t>
+        <w:t xml:space="preserve"> go out automatically: the buyer gets their estimate, the </w:t>
+      </w:r>
+      <w:r>
+        <w:rPr>
+          <w:b/>
+          <w:bCs/>
+        </w:rPr>
+        <w:t xml:space="preserve">assigned loan officer gets a new-lead alert in their own inbox</w:t>
+      </w:r>
+      <w:r>
+        <w:rPr>
+          <w:b w:val="false"/>
+          <w:bCs w:val="false"/>
+        </w:rPr>
+        <w:t xml:space="preserve">, and (if the buyer came through an agent) the agent gets a copy.</w:t>
       </w:r>
     </w:p>
     <w:tbl>
@@ -2466,7 +2743,21 @@
           <w:b w:val="false"/>
           <w:bCs w:val="false"/>
         </w:rPr>
-        <w:t xml:space="preserve"> — a buyer must check the consent box before a lead is captured. No consent, no lead.</w:t>
+        <w:t xml:space="preserve"> — a buyer must check the consent box before a lead is captured. No consent, no lead. This is the </w:t>
+      </w:r>
+      <w:r>
+        <w:rPr>
+          <w:b/>
+          <w:bCs/>
+        </w:rPr>
+        <w:t xml:space="preserve">Consent</w:t>
+      </w:r>
+      <w:r>
+        <w:rPr>
+          <w:b w:val="false"/>
+          <w:bCs w:val="false"/>
+        </w:rPr>
+        <w:t xml:space="preserve"> check in the leads table.</w:t>
       </w:r>
     </w:p>
     <w:p>
@@ -2490,7 +2781,7 @@
           <w:b w:val="false"/>
           <w:bCs w:val="false"/>
         </w:rPr>
-        <w:t xml:space="preserve"> — a buyer separately authorizes sharing their </w:t>
+        <w:t xml:space="preserve"> — a buyer *separately* authorizes sharing their </w:t>
       </w:r>
       <w:r>
         <w:rPr>
@@ -2504,7 +2795,21 @@
           <w:b w:val="false"/>
           <w:bCs w:val="false"/>
         </w:rPr>
-        <w:t xml:space="preserve"> with their referring agent; without it, the agent sees only "Connected," never progression.</w:t>
+        <w:t xml:space="preserve"> with their referring agent. This is the </w:t>
+      </w:r>
+      <w:r>
+        <w:rPr>
+          <w:b/>
+          <w:bCs/>
+        </w:rPr>
+        <w:t xml:space="preserve">Agent updates: Yes / No</w:t>
+      </w:r>
+      <w:r>
+        <w:rPr>
+          <w:b w:val="false"/>
+          <w:bCs w:val="false"/>
+        </w:rPr>
+        <w:t xml:space="preserve"> badge; without it the agent sees only "Connected," never progression.</w:t>
       </w:r>
     </w:p>
     <w:p>
@@ -2617,7 +2922,7 @@
           <w:b w:val="false"/>
           <w:bCs w:val="false"/>
         </w:rPr>
-        <w:t xml:space="preserve">Loan officers → add name / email / NMLS.</w:t>
+        <w:t xml:space="preserve">Loan officers → add name / email / NMLS / phone.</w:t>
       </w:r>
     </w:p>
     <w:p>
@@ -2634,7 +2939,7 @@
           <w:b w:val="false"/>
           <w:bCs w:val="false"/>
         </w:rPr>
-        <w:t xml:space="preserve">Email link → they set a password.</w:t>
+        <w:t xml:space="preserve">Email link → they set a password via the Continue page.</w:t>
       </w:r>
     </w:p>
     <w:p>
@@ -2693,7 +2998,7 @@
           <w:b w:val="false"/>
           <w:bCs w:val="false"/>
         </w:rPr>
-        <w:t xml:space="preserve">Email link → they receive both links.</w:t>
+        <w:t xml:space="preserve">Email links → they receive both links.</w:t>
       </w:r>
     </w:p>
     <w:p>
@@ -2721,7 +3026,183 @@
         <w:ind w:left="100" w:right="100"/>
       </w:pPr>
       <w:r>
-        <w:t xml:space="preserve">12.   Support</w:t>
+        <w:t xml:space="preserve">12.   Common questions</w:t>
+      </w:r>
+    </w:p>
+    <w:p>
+      <w:pPr>
+        <w:spacing w:after="120" w:line="276"/>
+      </w:pPr>
+      <w:r>
+        <w:rPr>
+          <w:b/>
+          <w:bCs/>
+        </w:rPr>
+        <w:t xml:space="preserve">A loan officer can't find their sign-in email.</w:t>
+      </w:r>
+      <w:r>
+        <w:rPr>
+          <w:b w:val="false"/>
+          <w:bCs w:val="false"/>
+        </w:rPr>
+        <w:t xml:space="preserve"> Have them check spam/junk and mark it "Not spam"; the </w:t>
+      </w:r>
+      <w:r>
+        <w:rPr>
+          <w:b/>
+          <w:bCs/>
+        </w:rPr>
+        <w:t xml:space="preserve">Continue</w:t>
+      </w:r>
+      <w:r>
+        <w:rPr>
+          <w:b w:val="false"/>
+          <w:bCs w:val="false"/>
+        </w:rPr>
+        <w:t xml:space="preserve"> link stays valid until it's used. Inbox delivery improves once your domain's email authentication (SPF, DKIM, and DMARC) is fully set up.</w:t>
+      </w:r>
+    </w:p>
+    <w:p>
+      <w:pPr>
+        <w:spacing w:after="120" w:line="276"/>
+      </w:pPr>
+      <w:r>
+        <w:rPr>
+          <w:b/>
+          <w:bCs/>
+        </w:rPr>
+        <w:t xml:space="preserve">I turned a loan officer off, but their agent's link still opened.</w:t>
+      </w:r>
+      <w:r>
+        <w:rPr>
+          <w:b w:val="false"/>
+          <w:bCs w:val="false"/>
+        </w:rPr>
+        <w:t xml:space="preserve"> It's revoked right away — just reload the page. Turning a loan officer off also turns off that loan officer's referral partners (their share and status links).</w:t>
+      </w:r>
+    </w:p>
+    <w:p>
+      <w:pPr>
+        <w:spacing w:after="120" w:line="276"/>
+      </w:pPr>
+      <w:r>
+        <w:rPr>
+          <w:b/>
+          <w:bCs/>
+        </w:rPr>
+        <w:t xml:space="preserve">A loan officer and an agent have similar names — which is which?</w:t>
+      </w:r>
+      <w:r>
+        <w:rPr>
+          <w:b w:val="false"/>
+          <w:bCs w:val="false"/>
+        </w:rPr>
+        <w:t xml:space="preserve"> A </w:t>
+      </w:r>
+      <w:r>
+        <w:rPr>
+          <w:b/>
+          <w:bCs/>
+        </w:rPr>
+        <w:t xml:space="preserve">Loan Officer</w:t>
+      </w:r>
+      <w:r>
+        <w:rPr>
+          <w:b w:val="false"/>
+          <w:bCs w:val="false"/>
+        </w:rPr>
+        <w:t xml:space="preserve"> has a login and works the loans; a </w:t>
+      </w:r>
+      <w:r>
+        <w:rPr>
+          <w:b/>
+          <w:bCs/>
+        </w:rPr>
+        <w:t xml:space="preserve">Referral Partner (Agent)</w:t>
+      </w:r>
+      <w:r>
+        <w:rPr>
+          <w:b w:val="false"/>
+          <w:bCs w:val="false"/>
+        </w:rPr>
+        <w:t xml:space="preserve"> has no login and only shares links. They are separate records even when the names look alike.</w:t>
+      </w:r>
+    </w:p>
+    <w:p>
+      <w:pPr>
+        <w:spacing w:after="120" w:line="276"/>
+      </w:pPr>
+      <w:r>
+        <w:rPr>
+          <w:b/>
+          <w:bCs/>
+        </w:rPr>
+        <w:t xml:space="preserve">A lead went to the wrong loan officer.</w:t>
+      </w:r>
+      <w:r>
+        <w:rPr>
+          <w:b w:val="false"/>
+          <w:bCs w:val="false"/>
+        </w:rPr>
+        <w:t xml:space="preserve"> Leads that come through an agent's link go to </w:t>
+      </w:r>
+      <w:r>
+        <w:rPr>
+          <w:b/>
+          <w:bCs/>
+        </w:rPr>
+        <w:t xml:space="preserve">that agent's</w:t>
+      </w:r>
+      <w:r>
+        <w:rPr>
+          <w:b w:val="false"/>
+          <w:bCs w:val="false"/>
+        </w:rPr>
+        <w:t xml:space="preserve"> loan officer; leads with no agent go to the </w:t>
+      </w:r>
+      <w:r>
+        <w:rPr>
+          <w:b/>
+          <w:bCs/>
+        </w:rPr>
+        <w:t xml:space="preserve">Primary</w:t>
+      </w:r>
+      <w:r>
+        <w:rPr>
+          <w:b w:val="false"/>
+          <w:bCs w:val="false"/>
+        </w:rPr>
+        <w:t xml:space="preserve">. Check which loan officer owns the agent, and who is set as Primary.</w:t>
+      </w:r>
+    </w:p>
+    <w:p>
+      <w:pPr>
+        <w:spacing w:after="120" w:line="276"/>
+      </w:pPr>
+      <w:r>
+        <w:rPr>
+          <w:b/>
+          <w:bCs/>
+        </w:rPr>
+        <w:t xml:space="preserve">Can two people share one email address?</w:t>
+      </w:r>
+      <w:r>
+        <w:rPr>
+          <w:b w:val="false"/>
+          <w:bCs w:val="false"/>
+        </w:rPr>
+        <w:t xml:space="preserve"> No — every login needs its own unique email. EarnedHome will block a duplicate.</w:t>
+      </w:r>
+    </w:p>
+    <w:p>
+      <w:pPr>
+        <w:pStyle w:val="Heading1"/>
+        <w:shd w:fill="EAF1F8" w:val="clear"/>
+        <w:spacing w:after="160" w:before="300"/>
+        <w:ind w:left="100" w:right="100"/>
+      </w:pPr>
+      <w:r>
+        <w:t xml:space="preserve">13.   Support</w:t>
       </w:r>
     </w:p>
     <w:p>

</xml_diff>

<commit_message>
Manuals: regenerate with forgot-password, per-LO visibility, sign-in email, reassignment, Request-access
</commit_message>
<xml_diff>
--- a/docs/manuals/EarnedHome-Broker-Administrator-Manual.docx
+++ b/docs/manuals/EarnedHome-Broker-Administrator-Manual.docx
@@ -1664,7 +1664,21 @@
           <w:b w:val="false"/>
           <w:bCs w:val="false"/>
         </w:rPr>
-        <w:t xml:space="preserve"> — update an LO's name, email, NMLS, or phone.</w:t>
+        <w:t xml:space="preserve"> — update an LO's name, email, NMLS, or phone. </w:t>
+      </w:r>
+      <w:r>
+        <w:rPr>
+          <w:b/>
+          <w:bCs/>
+        </w:rPr>
+        <w:t xml:space="preserve">Changing the email also updates that LO's sign-in login</w:t>
+      </w:r>
+      <w:r>
+        <w:rPr>
+          <w:b w:val="false"/>
+          <w:bCs w:val="false"/>
+        </w:rPr>
+        <w:t xml:space="preserve"> — they'll use the new address to log in and reset their password.</w:t>
       </w:r>
     </w:p>
     <w:p>
@@ -2118,7 +2132,21 @@
           <w:b w:val="false"/>
           <w:bCs w:val="false"/>
         </w:rPr>
-        <w:t xml:space="preserve"> — update the agent's details.</w:t>
+        <w:t xml:space="preserve"> — update the agent's details, including the </w:t>
+      </w:r>
+      <w:r>
+        <w:rPr>
+          <w:b/>
+          <w:bCs/>
+        </w:rPr>
+        <w:t xml:space="preserve">loan officer</w:t>
+      </w:r>
+      <w:r>
+        <w:rPr>
+          <w:b w:val="false"/>
+          <w:bCs w:val="false"/>
+        </w:rPr>
+        <w:t xml:space="preserve"> the agent belongs to.</w:t>
       </w:r>
     </w:p>
     <w:p>
@@ -2157,6 +2185,96 @@
           <w:bCs w:val="false"/>
         </w:rPr>
         <w:t xml:space="preserve"> to restore.</w:t>
+      </w:r>
+    </w:p>
+    <w:p>
+      <w:pPr>
+        <w:pStyle w:val="Heading2"/>
+      </w:pPr>
+      <w:r>
+        <w:t xml:space="preserve">Reassigning an agent to a different loan officer</w:t>
+      </w:r>
+    </w:p>
+    <w:p>
+      <w:pPr>
+        <w:spacing w:after="120" w:line="276"/>
+      </w:pPr>
+      <w:r>
+        <w:rPr>
+          <w:b w:val="false"/>
+          <w:bCs w:val="false"/>
+        </w:rPr>
+        <w:t xml:space="preserve">As admin you can move an agent to another loan officer — open </w:t>
+      </w:r>
+      <w:r>
+        <w:rPr>
+          <w:b/>
+          <w:bCs/>
+        </w:rPr>
+        <w:t xml:space="preserve">Edit</w:t>
+      </w:r>
+      <w:r>
+        <w:rPr>
+          <w:b w:val="false"/>
+          <w:bCs w:val="false"/>
+        </w:rPr>
+        <w:t xml:space="preserve"> and pick a new </w:t>
+      </w:r>
+      <w:r>
+        <w:rPr>
+          <w:b/>
+          <w:bCs/>
+        </w:rPr>
+        <w:t xml:space="preserve">Loan officer</w:t>
+      </w:r>
+      <w:r>
+        <w:rPr>
+          <w:b w:val="false"/>
+          <w:bCs w:val="false"/>
+        </w:rPr>
+        <w:t xml:space="preserve">. From then on, new buyers from that agent's link route to the new LO. Optionally tick </w:t>
+      </w:r>
+      <w:r>
+        <w:rPr>
+          <w:b/>
+          <w:bCs/>
+        </w:rPr>
+        <w:t xml:space="preserve">move open leads</w:t>
+      </w:r>
+      <w:r>
+        <w:rPr>
+          <w:b w:val="false"/>
+          <w:bCs w:val="false"/>
+        </w:rPr>
+        <w:t xml:space="preserve"> to bring the agent's </w:t>
+      </w:r>
+      <w:r>
+        <w:rPr>
+          <w:b/>
+          <w:bCs/>
+        </w:rPr>
+        <w:t xml:space="preserve">active</w:t>
+      </w:r>
+      <w:r>
+        <w:rPr>
+          <w:b w:val="false"/>
+          <w:bCs w:val="false"/>
+        </w:rPr>
+        <w:t xml:space="preserve"> leads along; </w:t>
+      </w:r>
+      <w:r>
+        <w:rPr>
+          <w:b/>
+          <w:bCs/>
+        </w:rPr>
+        <w:t xml:space="preserve">closed / funded leads stay</w:t>
+      </w:r>
+      <w:r>
+        <w:rPr>
+          <w:b w:val="false"/>
+          <w:bCs w:val="false"/>
+        </w:rPr>
+        <w:t xml:space="preserve"> with the original LO as their record.</w:t>
       </w:r>
     </w:p>
     <w:p>

</xml_diff>